<commit_message>
Add NCDOT AADT growth projections and background volumes section
Workbook: new AADT sheet with Page Road count history (stations
0320000269/0320000260), computed CAGRs, selectable 3.0% growth rate,
2028 Build year projections (12,800 vpd south / 8,200 vpd north of
Airport Road), and a difference-method lower-bound estimate for Airport
Road AADT. Memo: new Background Traffic Volumes section and conclusion
updated to reference background volumes. Build year is 2028 per City of
Durham TIA guidelines (conditions one year after completion; 2027
opening assumed).

Co-Authored-By: Claude Fable 5 <noreply@anthropic.com>
Claude-Session: https://claude.ai/code/session_017bgXFHUDEAABZN3aMvsVWj
</commit_message>
<xml_diff>
--- a/3905_Page_Rd_Trip_Generation/3905_Page_Road_Trip_Gen_Memo.docx
+++ b/3905_Page_Rd_Trip_Generation/3905_Page_Road_Trip_Gen_Memo.docx
@@ -1406,6 +1406,23 @@
         <w:spacing w:before="240"/>
       </w:pPr>
       <w:r>
+        <w:t>Background Traffic Volumes</w:t>
+      </w:r>
+    </w:p>
+    <w:p>
+      <w:pPr>
+        <w:pStyle w:val="BodyText"/>
+      </w:pPr>
+      <w:r>
+        <w:t xml:space="preserve">Based on NCDOT count data, Page Road (SR 1973) carries an Annual Average Daily Traffic (AADT) volume of 11,000 vehicles per day (vpd) south of Airport Road, where the site driveways are proposed, and 7,100 vpd north of Airport Road (2023). Historical counts indicate growth of approximately 1.8 to 5.1 percent per year south of Airport Road over the past ten years, with relatively flat volumes north of Airport Road; a 3.0 percent compound annual growth rate was conservatively applied corridor-wide. Consistent with the City of Durham TIA guidelines, which require the analysis to examine expected traffic conditions one year after the project is scheduled to be complete, background volumes were projected to a 2028 Build year (assuming a 2027 opening), resulting in approximately 12,800 vpd south of Airport Road and 8,200 vpd north of Airport Road.</w:t>
+      </w:r>
+    </w:p>
+    <w:p>
+      <w:pPr>
+        <w:pStyle w:val="Heading1"/>
+        <w:spacing w:before="240"/>
+      </w:pPr>
+      <w:r>
         <w:t>Conclusion</w:t>
       </w:r>
     </w:p>
@@ -1445,7 +1462,7 @@
         <w:fldChar w:fldCharType="end"/>
       </w:r>
       <w:r>
-        <w:t xml:space="preserve">, the proposed development is anticipated to generate 72 trips during the weekday AM peak hour and 74 trips during the weekday PM peak hour, fewer than 150 trips during both peak hours. Therefore, a Traffic Impact Analysis (TIA) is not required for the 3905 Page Road development under the City of Durham Unified Development Ordinance (UDO) Section 3.3 threshold. Given the relatively low site trip generation, the development is expected to have a minor traffic impact to the area.</w:t>
+        <w:t xml:space="preserve">, the proposed development is anticipated to generate 72 trips during the weekday AM peak hour and 74 trips during the weekday PM peak hour, fewer than 150 trips during both peak hours. Therefore, a Traffic Impact Analysis (TIA) is not required for the 3905 Page Road development under the City of Durham Unified Development Ordinance (UDO) Section 3.3 threshold. Given the relatively low site trip generation compared to existing and projected background volumes along Page Road, the development is expected to have a minor traffic impact to the area.</w:t>
       </w:r>
       <w:r>
         <w:rPr>

</xml_diff>

<commit_message>
Move trip gen table to standalone sheet; trim memo to threshold finding
Workbook restructured to TripGen (table only, formulas referencing a new
Rates sheet), Rates (ITE 12th Edition inputs + Durham UDO 3.3 threshold
check), AADT (growth projections, unchanged), and Dev. Memo drops the
Background Traffic Volumes section since the TIA determination rests
solely on site trips vs the 150-trip threshold; the conclusion keeps a
one-line reference to existing Page Road volumes (11,000 vpd, 2023 NCDOT
AADT) matching the template's style.

Co-Authored-By: Claude Fable 5 <noreply@anthropic.com>
Claude-Session: https://claude.ai/code/session_017bgXFHUDEAABZN3aMvsVWj
</commit_message>
<xml_diff>
--- a/3905_Page_Rd_Trip_Generation/3905_Page_Road_Trip_Gen_Memo.docx
+++ b/3905_Page_Rd_Trip_Generation/3905_Page_Road_Trip_Gen_Memo.docx
@@ -1406,23 +1406,6 @@
         <w:spacing w:before="240"/>
       </w:pPr>
       <w:r>
-        <w:t>Background Traffic Volumes</w:t>
-      </w:r>
-    </w:p>
-    <w:p>
-      <w:pPr>
-        <w:pStyle w:val="BodyText"/>
-      </w:pPr>
-      <w:r>
-        <w:t xml:space="preserve">Based on NCDOT count data, Page Road (SR 1973) carries an Annual Average Daily Traffic (AADT) volume of 11,000 vehicles per day (vpd) south of Airport Road, where the site driveways are proposed, and 7,100 vpd north of Airport Road (2023). Historical counts indicate growth of approximately 1.8 to 5.1 percent per year south of Airport Road over the past ten years, with relatively flat volumes north of Airport Road; a 3.0 percent compound annual growth rate was conservatively applied corridor-wide. Consistent with the City of Durham TIA guidelines, which require the analysis to examine expected traffic conditions one year after the project is scheduled to be complete, background volumes were projected to a 2028 Build year (assuming a 2027 opening), resulting in approximately 12,800 vpd south of Airport Road and 8,200 vpd north of Airport Road.</w:t>
-      </w:r>
-    </w:p>
-    <w:p>
-      <w:pPr>
-        <w:pStyle w:val="Heading1"/>
-        <w:spacing w:before="240"/>
-      </w:pPr>
-      <w:r>
         <w:t>Conclusion</w:t>
       </w:r>
     </w:p>
@@ -1462,7 +1445,7 @@
         <w:fldChar w:fldCharType="end"/>
       </w:r>
       <w:r>
-        <w:t xml:space="preserve">, the proposed development is anticipated to generate 72 trips during the weekday AM peak hour and 74 trips during the weekday PM peak hour, fewer than 150 trips during both peak hours. Therefore, a Traffic Impact Analysis (TIA) is not required for the 3905 Page Road development under the City of Durham Unified Development Ordinance (UDO) Section 3.3 threshold. Given the relatively low site trip generation compared to existing and projected background volumes along Page Road, the development is expected to have a minor traffic impact to the area.</w:t>
+        <w:t xml:space="preserve">, the proposed development is anticipated to generate 72 trips during the weekday AM peak hour and 74 trips during the weekday PM peak hour, fewer than 150 trips during both peak hours. Therefore, a Traffic Impact Analysis (TIA) is not required for the 3905 Page Road development under the City of Durham Unified Development Ordinance (UDO) Section 3.3 threshold. Given the relatively low site trip generation compared to existing traffic volumes along Page Road (11,000 vehicles per day south of Airport Road, per 2023 NCDOT AADT data), the development is expected to have a minor traffic impact to the area.</w:t>
       </w:r>
       <w:r>
         <w:rPr>

</xml_diff>

<commit_message>
Reorder conclusion logic and set appendix plan page to landscape
Built on the user's tweaked draft. Conclusion now states the UDO 3.3
rule first (TIA required at 150+ peak hour trips), then the Table 1
results, then the finding, replacing the threshold-after-citation
phrasing. The appendix concept plan now sits on a true landscape page
via a section break, with the unrotated plan image.

Co-Authored-By: Claude Fable 5 <noreply@anthropic.com>
Claude-Session: https://claude.ai/code/session_017bgXFHUDEAABZN3aMvsVWj
</commit_message>
<xml_diff>
--- a/3905_Page_Rd_Trip_Generation/3905_Page_Road_Trip_Gen_Memo.docx
+++ b/3905_Page_Rd_Trip_Generation/3905_Page_Road_Trip_Gen_Memo.docx
@@ -350,7 +350,7 @@
               <w:rPr>
                 <w:sz w:val="18"/>
               </w:rPr>
-              <w:t xml:space="preserve">Durham, NC</w:t>
+              <w:t>Durham, NC</w:t>
             </w:r>
           </w:p>
         </w:tc>
@@ -363,7 +363,7 @@
         <w:contextualSpacing/>
       </w:pPr>
       <w:r>
-        <w:t xml:space="preserve">This memorandum provides an assessment of the trip generation (site generated traffic volumes) for a proposed industrial development at 3905 Page Road in Durham, NC.</w:t>
+        <w:t>This memorandum provides an assessment of the trip generation (site generated traffic volumes) for a proposed industrial development at 3905 Page Road in Durham, NC.</w:t>
       </w:r>
       <w:r>
         <w:rPr>
@@ -388,10 +388,9 @@
         <w:spacing w:line="240" w:lineRule="auto"/>
       </w:pPr>
       <w:r>
-        <w:t xml:space="preserve">The development at 3905 Page Road is located at the intersection of Page Road (SR 1973) and Airport Road (SR 1971), with frontage along both roadways. The concept plan is shown in </w:t>
+        <w:t xml:space="preserve">The development at 3905 Page Road is located at the intersection of Page Road (SR 1973) and Airport Road (SR 1971), with frontage along both roadways. A concept plan is shown in </w:t>
         <w:fldChar w:fldCharType="begin"/>
-        <w:instrText xml:space="preserve"> REF _Ref208974195 \h </w:instrText>
-        <w:instrText xml:space="preserve"> \* MERGEFORMAT </w:instrText>
+        <w:instrText xml:space="preserve"> REF _Ref208974195 \h  \* MERGEFORMAT </w:instrText>
         <w:fldChar w:fldCharType="separate"/>
       </w:r>
       <w:r>
@@ -409,7 +408,7 @@
       </w:r>
       <w:r>
         <w:fldChar w:fldCharType="end"/>
-        <w:t xml:space="preserve"> below and available in the Appendix located at the end of the memo. Although the specific tenant has not been identified, the development is planned to be a single industrial building for light industrial use. The total building square footage in the concept plan is 132,080 sf; however, the analysis assumes up to 150,000 sf to provide a conservative buffer for minor changes to the building. Access is proposed via two (2) driveways on Page Road and two (2) driveways on Airport Road.</w:t>
+        <w:t xml:space="preserve"> below and available in the Appendix located at the end of the memo. Although the specific tenant has not been identified, the development is planned to be a single industrial building for light industrial use. The total building square footage in this concept plan is 132,080 sf; however, the analysis assumes up to 150,000 sf to provide a conservative buffer for minor changes to the building. Access is proposed via two (2) driveways on Page Road and two (2) driveways on Airport Road.</w:t>
       </w:r>
     </w:p>
     <w:p>
@@ -422,7 +421,7 @@
           <w:noProof/>
         </w:rPr>
         <w:drawing>
-          <wp:inline distT="0" distB="0" distL="0" distR="0" wp14:anchorId="459F0185" wp14:editId="000A18F2">
+          <wp:inline distT="0" distB="0" distL="0" distR="0" wp14:anchorId="19D45A08" wp14:editId="028E9EAE">
             <wp:extent cx="5943600" cy="4245429"/>
             <wp:effectExtent l="0" t="0" r="635" b="2540"/>
             <wp:docPr id="728698907" name="Picture 1" descr="A map of a city  AI-generated content may be incorrect."/>
@@ -495,7 +494,7 @@
         <w:rPr>
           <w:rStyle w:val="TableTitleChar"/>
         </w:rPr>
-        <w:t xml:space="preserve">: Concept Plan (also available at the end of the memo)</w:t>
+        <w:t>: Concept Plan (also available at the end of the memo)</w:t>
       </w:r>
     </w:p>
     <w:p>
@@ -560,7 +559,7 @@
         <w:rPr>
           <w:rStyle w:val="TableTitleChar"/>
         </w:rPr>
-        <w:t xml:space="preserve">Table 1</w:t>
+        <w:t>Table 1</w:t>
       </w:r>
       <w:r>
         <w:rPr>
@@ -648,7 +647,7 @@
           <w:i w:val="0"/>
           <w:iCs w:val="0"/>
         </w:rPr>
-        <w:t xml:space="preserve">Trip Generation – 3905 Page Road Development in Durham, NC</w:t>
+        <w:t>Trip Generation – 3905 Page Road Development in Durham, NC</w:t>
       </w:r>
     </w:p>
     <w:tbl>
@@ -684,6 +683,9 @@
         <w:gridCol w:w="720"/>
       </w:tblGrid>
       <w:tr>
+        <w:trPr>
+          <w:jc w:val="center"/>
+        </w:trPr>
         <w:tc>
           <w:tcPr>
             <w:tcW w:w="720" w:type="dxa"/>
@@ -692,23 +694,19 @@
           </w:tcPr>
           <w:p>
             <w:pPr>
-              <w:spacing w:after="0" w:line="240" w:lineRule="auto"/>
               <w:jc w:val="center"/>
               <w:rPr>
-                <w:rFonts w:ascii="Segoe UI" w:hAnsi="Segoe UI"/>
                 <w:sz w:val="20"/>
               </w:rPr>
             </w:pPr>
             <w:r>
               <w:rPr>
-                <w:rFonts w:ascii="Segoe UI" w:hAnsi="Segoe UI"/>
-                <w:sz w:val="20"/>
-              </w:rPr>
-              <w:t xml:space="preserve">LUC</w:t>
+                <w:sz w:val="20"/>
+              </w:rPr>
+              <w:t>LUC</w:t>
             </w:r>
             <w:r>
               <w:rPr>
-                <w:rFonts w:ascii="Segoe UI" w:hAnsi="Segoe UI"/>
                 <w:sz w:val="20"/>
                 <w:vertAlign w:val="superscript"/>
               </w:rPr>
@@ -724,19 +722,16 @@
           </w:tcPr>
           <w:p>
             <w:pPr>
-              <w:spacing w:after="0" w:line="240" w:lineRule="auto"/>
               <w:jc w:val="center"/>
               <w:rPr>
-                <w:rFonts w:ascii="Segoe UI" w:hAnsi="Segoe UI"/>
                 <w:sz w:val="20"/>
               </w:rPr>
             </w:pPr>
             <w:r>
               <w:rPr>
-                <w:rFonts w:ascii="Segoe UI" w:hAnsi="Segoe UI"/>
-                <w:sz w:val="20"/>
-              </w:rPr>
-              <w:t xml:space="preserve">Land Use</w:t>
+                <w:sz w:val="20"/>
+              </w:rPr>
+              <w:t>Land Use</w:t>
             </w:r>
           </w:p>
         </w:tc>
@@ -748,19 +743,16 @@
           </w:tcPr>
           <w:p>
             <w:pPr>
-              <w:spacing w:after="0" w:line="240" w:lineRule="auto"/>
               <w:jc w:val="center"/>
               <w:rPr>
-                <w:rFonts w:ascii="Segoe UI" w:hAnsi="Segoe UI"/>
                 <w:sz w:val="20"/>
               </w:rPr>
             </w:pPr>
             <w:r>
               <w:rPr>
-                <w:rFonts w:ascii="Segoe UI" w:hAnsi="Segoe UI"/>
-                <w:sz w:val="20"/>
-              </w:rPr>
-              <w:t xml:space="preserve">Unit</w:t>
+                <w:sz w:val="20"/>
+              </w:rPr>
+              <w:t>Unit</w:t>
             </w:r>
           </w:p>
         </w:tc>
@@ -772,19 +764,16 @@
           </w:tcPr>
           <w:p>
             <w:pPr>
-              <w:spacing w:after="0" w:line="240" w:lineRule="auto"/>
               <w:jc w:val="center"/>
               <w:rPr>
-                <w:rFonts w:ascii="Segoe UI" w:hAnsi="Segoe UI"/>
                 <w:sz w:val="20"/>
               </w:rPr>
             </w:pPr>
             <w:r>
               <w:rPr>
-                <w:rFonts w:ascii="Segoe UI" w:hAnsi="Segoe UI"/>
-                <w:sz w:val="20"/>
-              </w:rPr>
-              <w:t xml:space="preserve">ADT</w:t>
+                <w:sz w:val="20"/>
+              </w:rPr>
+              <w:t>ADT</w:t>
             </w:r>
           </w:p>
         </w:tc>
@@ -796,19 +785,16 @@
           </w:tcPr>
           <w:p>
             <w:pPr>
-              <w:spacing w:after="0" w:line="240" w:lineRule="auto"/>
               <w:jc w:val="center"/>
               <w:rPr>
-                <w:rFonts w:ascii="Segoe UI" w:hAnsi="Segoe UI"/>
                 <w:sz w:val="20"/>
               </w:rPr>
             </w:pPr>
             <w:r>
               <w:rPr>
-                <w:rFonts w:ascii="Segoe UI" w:hAnsi="Segoe UI"/>
-                <w:sz w:val="20"/>
-              </w:rPr>
-              <w:t xml:space="preserve">AM Peak Hour</w:t>
+                <w:sz w:val="20"/>
+              </w:rPr>
+              <w:t>AM Peak Hour</w:t>
             </w:r>
           </w:p>
         </w:tc>
@@ -820,24 +806,24 @@
           </w:tcPr>
           <w:p>
             <w:pPr>
-              <w:spacing w:after="0" w:line="240" w:lineRule="auto"/>
               <w:jc w:val="center"/>
               <w:rPr>
-                <w:rFonts w:ascii="Segoe UI" w:hAnsi="Segoe UI"/>
                 <w:sz w:val="20"/>
               </w:rPr>
             </w:pPr>
             <w:r>
               <w:rPr>
-                <w:rFonts w:ascii="Segoe UI" w:hAnsi="Segoe UI"/>
-                <w:sz w:val="20"/>
-              </w:rPr>
-              <w:t xml:space="preserve">PM Peak Hour</w:t>
+                <w:sz w:val="20"/>
+              </w:rPr>
+              <w:t>PM Peak Hour</w:t>
             </w:r>
           </w:p>
         </w:tc>
       </w:tr>
       <w:tr>
+        <w:trPr>
+          <w:jc w:val="center"/>
+        </w:trPr>
         <w:tc>
           <w:tcPr>
             <w:tcW w:w="720" w:type="dxa"/>
@@ -846,10 +832,8 @@
           </w:tcPr>
           <w:p>
             <w:pPr>
-              <w:spacing w:after="0" w:line="240" w:lineRule="auto"/>
               <w:jc w:val="center"/>
               <w:rPr>
-                <w:rFonts w:ascii="Segoe UI" w:hAnsi="Segoe UI"/>
                 <w:sz w:val="20"/>
               </w:rPr>
             </w:pPr>
@@ -863,10 +847,8 @@
           </w:tcPr>
           <w:p>
             <w:pPr>
-              <w:spacing w:after="0" w:line="240" w:lineRule="auto"/>
               <w:jc w:val="center"/>
               <w:rPr>
-                <w:rFonts w:ascii="Segoe UI" w:hAnsi="Segoe UI"/>
                 <w:sz w:val="20"/>
               </w:rPr>
             </w:pPr>
@@ -880,10 +862,8 @@
           </w:tcPr>
           <w:p>
             <w:pPr>
-              <w:spacing w:after="0" w:line="240" w:lineRule="auto"/>
               <w:jc w:val="center"/>
               <w:rPr>
-                <w:rFonts w:ascii="Segoe UI" w:hAnsi="Segoe UI"/>
                 <w:sz w:val="20"/>
               </w:rPr>
             </w:pPr>
@@ -897,10 +877,8 @@
           </w:tcPr>
           <w:p>
             <w:pPr>
-              <w:spacing w:after="0" w:line="240" w:lineRule="auto"/>
               <w:jc w:val="center"/>
               <w:rPr>
-                <w:rFonts w:ascii="Segoe UI" w:hAnsi="Segoe UI"/>
                 <w:sz w:val="20"/>
               </w:rPr>
             </w:pPr>
@@ -916,19 +894,16 @@
           </w:tcPr>
           <w:p>
             <w:pPr>
-              <w:spacing w:after="0" w:line="240" w:lineRule="auto"/>
               <w:jc w:val="center"/>
               <w:rPr>
-                <w:rFonts w:ascii="Segoe UI" w:hAnsi="Segoe UI"/>
                 <w:sz w:val="20"/>
               </w:rPr>
             </w:pPr>
             <w:r>
               <w:rPr>
-                <w:rFonts w:ascii="Segoe UI" w:hAnsi="Segoe UI"/>
-                <w:sz w:val="20"/>
-              </w:rPr>
-              <w:t xml:space="preserve">Enter</w:t>
+                <w:sz w:val="20"/>
+              </w:rPr>
+              <w:t>Enter</w:t>
             </w:r>
           </w:p>
         </w:tc>
@@ -942,19 +917,16 @@
           </w:tcPr>
           <w:p>
             <w:pPr>
-              <w:spacing w:after="0" w:line="240" w:lineRule="auto"/>
               <w:jc w:val="center"/>
               <w:rPr>
-                <w:rFonts w:ascii="Segoe UI" w:hAnsi="Segoe UI"/>
                 <w:sz w:val="20"/>
               </w:rPr>
             </w:pPr>
             <w:r>
               <w:rPr>
-                <w:rFonts w:ascii="Segoe UI" w:hAnsi="Segoe UI"/>
-                <w:sz w:val="20"/>
-              </w:rPr>
-              <w:t xml:space="preserve">Exit</w:t>
+                <w:sz w:val="20"/>
+              </w:rPr>
+              <w:t>Exit</w:t>
             </w:r>
           </w:p>
         </w:tc>
@@ -968,19 +940,16 @@
           </w:tcPr>
           <w:p>
             <w:pPr>
-              <w:spacing w:after="0" w:line="240" w:lineRule="auto"/>
               <w:jc w:val="center"/>
               <w:rPr>
-                <w:rFonts w:ascii="Segoe UI" w:hAnsi="Segoe UI"/>
                 <w:sz w:val="20"/>
               </w:rPr>
             </w:pPr>
             <w:r>
               <w:rPr>
-                <w:rFonts w:ascii="Segoe UI" w:hAnsi="Segoe UI"/>
-                <w:sz w:val="20"/>
-              </w:rPr>
-              <w:t xml:space="preserve">Total</w:t>
+                <w:sz w:val="20"/>
+              </w:rPr>
+              <w:t>Total</w:t>
             </w:r>
           </w:p>
         </w:tc>
@@ -994,19 +963,16 @@
           </w:tcPr>
           <w:p>
             <w:pPr>
-              <w:spacing w:after="0" w:line="240" w:lineRule="auto"/>
               <w:jc w:val="center"/>
               <w:rPr>
-                <w:rFonts w:ascii="Segoe UI" w:hAnsi="Segoe UI"/>
                 <w:sz w:val="20"/>
               </w:rPr>
             </w:pPr>
             <w:r>
               <w:rPr>
-                <w:rFonts w:ascii="Segoe UI" w:hAnsi="Segoe UI"/>
-                <w:sz w:val="20"/>
-              </w:rPr>
-              <w:t xml:space="preserve">Enter</w:t>
+                <w:sz w:val="20"/>
+              </w:rPr>
+              <w:t>Enter</w:t>
             </w:r>
           </w:p>
         </w:tc>
@@ -1020,19 +986,16 @@
           </w:tcPr>
           <w:p>
             <w:pPr>
-              <w:spacing w:after="0" w:line="240" w:lineRule="auto"/>
               <w:jc w:val="center"/>
               <w:rPr>
-                <w:rFonts w:ascii="Segoe UI" w:hAnsi="Segoe UI"/>
                 <w:sz w:val="20"/>
               </w:rPr>
             </w:pPr>
             <w:r>
               <w:rPr>
-                <w:rFonts w:ascii="Segoe UI" w:hAnsi="Segoe UI"/>
-                <w:sz w:val="20"/>
-              </w:rPr>
-              <w:t xml:space="preserve">Exit</w:t>
+                <w:sz w:val="20"/>
+              </w:rPr>
+              <w:t>Exit</w:t>
             </w:r>
           </w:p>
         </w:tc>
@@ -1046,24 +1009,24 @@
           </w:tcPr>
           <w:p>
             <w:pPr>
-              <w:spacing w:after="0" w:line="240" w:lineRule="auto"/>
               <w:jc w:val="center"/>
               <w:rPr>
-                <w:rFonts w:ascii="Segoe UI" w:hAnsi="Segoe UI"/>
                 <w:sz w:val="20"/>
               </w:rPr>
             </w:pPr>
             <w:r>
               <w:rPr>
-                <w:rFonts w:ascii="Segoe UI" w:hAnsi="Segoe UI"/>
-                <w:sz w:val="20"/>
-              </w:rPr>
-              <w:t xml:space="preserve">Total</w:t>
+                <w:sz w:val="20"/>
+              </w:rPr>
+              <w:t>Total</w:t>
             </w:r>
           </w:p>
         </w:tc>
       </w:tr>
       <w:tr>
+        <w:trPr>
+          <w:jc w:val="center"/>
+        </w:trPr>
         <w:tc>
           <w:tcPr>
             <w:tcW w:w="10440" w:type="dxa"/>
@@ -1072,25 +1035,21 @@
           </w:tcPr>
           <w:p>
             <w:pPr>
-              <w:spacing w:after="0" w:line="240" w:lineRule="auto"/>
               <w:jc w:val="center"/>
               <w:rPr>
-                <w:rFonts w:ascii="Segoe UI" w:hAnsi="Segoe UI"/>
                 <w:b/>
                 <w:sz w:val="20"/>
               </w:rPr>
             </w:pPr>
             <w:r>
               <w:rPr>
-                <w:rFonts w:ascii="Segoe UI" w:hAnsi="Segoe UI"/>
                 <w:b/>
                 <w:sz w:val="20"/>
               </w:rPr>
-              <w:t xml:space="preserve">Total Site Trips</w:t>
+              <w:t>Total Site Trips</w:t>
             </w:r>
             <w:r>
               <w:rPr>
-                <w:rFonts w:ascii="Segoe UI" w:hAnsi="Segoe UI"/>
                 <w:b/>
                 <w:sz w:val="20"/>
                 <w:vertAlign w:val="superscript"/>
@@ -1101,6 +1060,9 @@
         </w:tc>
       </w:tr>
       <w:tr>
+        <w:trPr>
+          <w:jc w:val="center"/>
+        </w:trPr>
         <w:tc>
           <w:tcPr>
             <w:tcW w:w="720" w:type="dxa"/>
@@ -1108,19 +1070,16 @@
           </w:tcPr>
           <w:p>
             <w:pPr>
-              <w:spacing w:after="0" w:line="240" w:lineRule="auto"/>
               <w:jc w:val="center"/>
               <w:rPr>
-                <w:rFonts w:ascii="Segoe UI" w:hAnsi="Segoe UI"/>
                 <w:sz w:val="20"/>
               </w:rPr>
             </w:pPr>
             <w:r>
               <w:rPr>
-                <w:rFonts w:ascii="Segoe UI" w:hAnsi="Segoe UI"/>
-                <w:sz w:val="20"/>
-              </w:rPr>
-              <w:t xml:space="preserve">110</w:t>
+                <w:sz w:val="20"/>
+              </w:rPr>
+              <w:t>110</w:t>
             </w:r>
           </w:p>
         </w:tc>
@@ -1131,19 +1090,15 @@
           </w:tcPr>
           <w:p>
             <w:pPr>
-              <w:spacing w:after="0" w:line="240" w:lineRule="auto"/>
-              <w:jc w:val="left"/>
-              <w:rPr>
-                <w:rFonts w:ascii="Segoe UI" w:hAnsi="Segoe UI"/>
+              <w:rPr>
                 <w:sz w:val="20"/>
               </w:rPr>
             </w:pPr>
             <w:r>
               <w:rPr>
-                <w:rFonts w:ascii="Segoe UI" w:hAnsi="Segoe UI"/>
-                <w:sz w:val="20"/>
-              </w:rPr>
-              <w:t xml:space="preserve">Light Industrial</w:t>
+                <w:sz w:val="20"/>
+              </w:rPr>
+              <w:t>Light Industrial</w:t>
             </w:r>
           </w:p>
         </w:tc>
@@ -1154,19 +1109,16 @@
           </w:tcPr>
           <w:p>
             <w:pPr>
-              <w:spacing w:after="0" w:line="240" w:lineRule="auto"/>
               <w:jc w:val="center"/>
               <w:rPr>
-                <w:rFonts w:ascii="Segoe UI" w:hAnsi="Segoe UI"/>
                 <w:sz w:val="20"/>
               </w:rPr>
             </w:pPr>
             <w:r>
               <w:rPr>
-                <w:rFonts w:ascii="Segoe UI" w:hAnsi="Segoe UI"/>
-                <w:sz w:val="20"/>
-              </w:rPr>
-              <w:t xml:space="preserve">150,000 sf</w:t>
+                <w:sz w:val="20"/>
+              </w:rPr>
+              <w:t>150,000 sf</w:t>
             </w:r>
           </w:p>
         </w:tc>
@@ -1177,19 +1129,16 @@
           </w:tcPr>
           <w:p>
             <w:pPr>
-              <w:spacing w:after="0" w:line="240" w:lineRule="auto"/>
               <w:jc w:val="center"/>
               <w:rPr>
-                <w:rFonts w:ascii="Segoe UI" w:hAnsi="Segoe UI"/>
                 <w:sz w:val="20"/>
               </w:rPr>
             </w:pPr>
             <w:r>
               <w:rPr>
-                <w:rFonts w:ascii="Segoe UI" w:hAnsi="Segoe UI"/>
-                <w:sz w:val="20"/>
-              </w:rPr>
-              <w:t xml:space="preserve">540</w:t>
+                <w:sz w:val="20"/>
+              </w:rPr>
+              <w:t>540</w:t>
             </w:r>
           </w:p>
         </w:tc>
@@ -1200,19 +1149,16 @@
           </w:tcPr>
           <w:p>
             <w:pPr>
-              <w:spacing w:after="0" w:line="240" w:lineRule="auto"/>
               <w:jc w:val="center"/>
               <w:rPr>
-                <w:rFonts w:ascii="Segoe UI" w:hAnsi="Segoe UI"/>
                 <w:sz w:val="20"/>
               </w:rPr>
             </w:pPr>
             <w:r>
               <w:rPr>
-                <w:rFonts w:ascii="Segoe UI" w:hAnsi="Segoe UI"/>
-                <w:sz w:val="20"/>
-              </w:rPr>
-              <w:t xml:space="preserve">62</w:t>
+                <w:sz w:val="20"/>
+              </w:rPr>
+              <w:t>62</w:t>
             </w:r>
           </w:p>
         </w:tc>
@@ -1223,19 +1169,16 @@
           </w:tcPr>
           <w:p>
             <w:pPr>
-              <w:spacing w:after="0" w:line="240" w:lineRule="auto"/>
               <w:jc w:val="center"/>
               <w:rPr>
-                <w:rFonts w:ascii="Segoe UI" w:hAnsi="Segoe UI"/>
                 <w:sz w:val="20"/>
               </w:rPr>
             </w:pPr>
             <w:r>
               <w:rPr>
-                <w:rFonts w:ascii="Segoe UI" w:hAnsi="Segoe UI"/>
-                <w:sz w:val="20"/>
-              </w:rPr>
-              <w:t xml:space="preserve">10</w:t>
+                <w:sz w:val="20"/>
+              </w:rPr>
+              <w:t>10</w:t>
             </w:r>
           </w:p>
         </w:tc>
@@ -1246,19 +1189,16 @@
           </w:tcPr>
           <w:p>
             <w:pPr>
-              <w:spacing w:after="0" w:line="240" w:lineRule="auto"/>
               <w:jc w:val="center"/>
               <w:rPr>
-                <w:rFonts w:ascii="Segoe UI" w:hAnsi="Segoe UI"/>
                 <w:sz w:val="20"/>
               </w:rPr>
             </w:pPr>
             <w:r>
               <w:rPr>
-                <w:rFonts w:ascii="Segoe UI" w:hAnsi="Segoe UI"/>
-                <w:sz w:val="20"/>
-              </w:rPr>
-              <w:t xml:space="preserve">72</w:t>
+                <w:sz w:val="20"/>
+              </w:rPr>
+              <w:t>72</w:t>
             </w:r>
           </w:p>
         </w:tc>
@@ -1269,19 +1209,16 @@
           </w:tcPr>
           <w:p>
             <w:pPr>
-              <w:spacing w:after="0" w:line="240" w:lineRule="auto"/>
               <w:jc w:val="center"/>
               <w:rPr>
-                <w:rFonts w:ascii="Segoe UI" w:hAnsi="Segoe UI"/>
                 <w:sz w:val="20"/>
               </w:rPr>
             </w:pPr>
             <w:r>
               <w:rPr>
-                <w:rFonts w:ascii="Segoe UI" w:hAnsi="Segoe UI"/>
-                <w:sz w:val="20"/>
-              </w:rPr>
-              <w:t xml:space="preserve">18</w:t>
+                <w:sz w:val="20"/>
+              </w:rPr>
+              <w:t>18</w:t>
             </w:r>
           </w:p>
         </w:tc>
@@ -1292,19 +1229,16 @@
           </w:tcPr>
           <w:p>
             <w:pPr>
-              <w:spacing w:after="0" w:line="240" w:lineRule="auto"/>
               <w:jc w:val="center"/>
               <w:rPr>
-                <w:rFonts w:ascii="Segoe UI" w:hAnsi="Segoe UI"/>
                 <w:sz w:val="20"/>
               </w:rPr>
             </w:pPr>
             <w:r>
               <w:rPr>
-                <w:rFonts w:ascii="Segoe UI" w:hAnsi="Segoe UI"/>
-                <w:sz w:val="20"/>
-              </w:rPr>
-              <w:t xml:space="preserve">56</w:t>
+                <w:sz w:val="20"/>
+              </w:rPr>
+              <w:t>56</w:t>
             </w:r>
           </w:p>
         </w:tc>
@@ -1315,19 +1249,16 @@
           </w:tcPr>
           <w:p>
             <w:pPr>
-              <w:spacing w:after="0" w:line="240" w:lineRule="auto"/>
               <w:jc w:val="center"/>
               <w:rPr>
-                <w:rFonts w:ascii="Segoe UI" w:hAnsi="Segoe UI"/>
                 <w:sz w:val="20"/>
               </w:rPr>
             </w:pPr>
             <w:r>
               <w:rPr>
-                <w:rFonts w:ascii="Segoe UI" w:hAnsi="Segoe UI"/>
-                <w:sz w:val="20"/>
-              </w:rPr>
-              <w:t xml:space="preserve">74</w:t>
+                <w:sz w:val="20"/>
+              </w:rPr>
+              <w:t>74</w:t>
             </w:r>
           </w:p>
         </w:tc>
@@ -1397,7 +1328,7 @@
           <w:sz w:val="16"/>
           <w:szCs w:val="16"/>
         </w:rPr>
-        <w:t xml:space="preserve">2. Total site trips are determined based on the ITE average rates</w:t>
+        <w:t>2. Total site trips are determined based on the ITE average rates</w:t>
       </w:r>
     </w:p>
     <w:p>
@@ -1414,7 +1345,7 @@
         <w:pStyle w:val="BodyText"/>
       </w:pPr>
       <w:r>
-        <w:t xml:space="preserve">Based on the trip generation results in </w:t>
+        <w:t xml:space="preserve">Per Section 3.3 of the City of Durham Unified Development Ordinance (UDO), a Traffic Impact Analysis (TIA) is required for developments anticipated to generate 150 or more vehicle trips during a peak hour. As shown in </w:t>
       </w:r>
       <w:r>
         <w:rPr>
@@ -1436,7 +1367,7 @@
         <w:rPr>
           <w:rStyle w:val="TableTitleChar"/>
         </w:rPr>
-        <w:t xml:space="preserve">Table 1</w:t>
+        <w:t>Table 1</w:t>
       </w:r>
       <w:r>
         <w:rPr>
@@ -1445,7 +1376,7 @@
         <w:fldChar w:fldCharType="end"/>
       </w:r>
       <w:r>
-        <w:t xml:space="preserve">, the proposed development is anticipated to generate 72 trips during the weekday AM peak hour and 74 trips during the weekday PM peak hour, fewer than 150 trips during both peak hours. Therefore, a Traffic Impact Analysis (TIA) is not required for the 3905 Page Road development under the City of Durham Unified Development Ordinance (UDO) Section 3.3 threshold. In addition, the total site trip generation of 540 daily trips is well below the NCDOT TIA threshold of 3,000 daily trips. Given the relatively low site trip generation, the development is expected to have a minor traffic impact to the area.</w:t>
+        <w:t>, the proposed development is anticipated to generate 72 trips during the weekday AM peak hour and 74 trips during the weekday PM peak hour; therefore, a TIA is not required for the 3905 Page Road development. In addition, the total site trip generation of 540 daily trips is well below the NCDOT TIA threshold of 3,000 daily trips.</w:t>
       </w:r>
       <w:r>
         <w:rPr>
@@ -1494,16 +1425,30 @@
     </w:p>
     <w:p>
       <w:pPr>
-        <w:spacing w:after="0" w:line="240" w:lineRule="auto"/>
+        <w:sectPr>
+          <w:headerReference w:type="default" r:id="rId13"/>
+          <w:headerReference w:type="first" r:id="rId14"/>
+          <w:footerReference w:type="first" r:id="rId15"/>
+          <w:pgSz w:w="12240" w:h="15840"/>
+          <w:pgMar w:top="2074" w:right="720" w:bottom="1296" w:left="1080" w:header="720" w:footer="288" w:gutter="0"/>
+          <w:cols w:space="720"/>
+          <w:titlePg/>
+          <w:docGrid w:linePitch="360"/>
+        </w:sectPr>
+      </w:pPr>
+    </w:p>
+    <w:p>
+      <w:pPr>
         <w:jc w:val="center"/>
       </w:pPr>
       <w:r>
         <w:rPr>
           <w:noProof/>
         </w:rPr>
+        <w:lastRenderedPageBreak/>
         <w:drawing>
-          <wp:inline distT="0" distB="0" distL="0" distR="0">
-            <wp:extent cx="5617029" cy="7863840"/>
+          <wp:inline distT="0" distB="0" distL="0" distR="0" wp14:anchorId="346A2E69" wp14:editId="68834AA3">
+            <wp:extent cx="7728000" cy="5520000"/>
             <wp:effectExtent l="0" t="0" r="0" b="0"/>
             <wp:docPr id="900" name="Picture 900" descr="Concept plan - 3905 Page Rd"/>
             <wp:cNvGraphicFramePr>
@@ -1517,7 +1462,7 @@
                     <pic:cNvPicPr/>
                   </pic:nvPicPr>
                   <pic:blipFill>
-                    <a:blip r:embed="rId18"/>
+                    <a:blip r:embed="rId12"/>
                     <a:stretch>
                       <a:fillRect/>
                     </a:stretch>
@@ -1525,7 +1470,7 @@
                   <pic:spPr>
                     <a:xfrm>
                       <a:off x="0" y="0"/>
-                      <a:ext cx="5617029" cy="7863840"/>
+                      <a:ext cx="7728000" cy="5520000"/>
                     </a:xfrm>
                     <a:prstGeom prst="rect">
                       <a:avLst/>
@@ -1542,10 +1487,9 @@
       <w:headerReference w:type="default" r:id="rId13"/>
       <w:headerReference w:type="first" r:id="rId14"/>
       <w:footerReference w:type="first" r:id="rId15"/>
-      <w:pgSz w:w="12240" w:h="15840"/>
+      <w:pgSz w:w="15840" w:h="12240" w:orient="landscape"/>
       <w:pgMar w:top="2074" w:right="720" w:bottom="1296" w:left="1080" w:header="720" w:footer="288" w:gutter="0"/>
       <w:cols w:space="720"/>
-      <w:titlePg/>
       <w:docGrid w:linePitch="360"/>
     </w:sectPr>
   </w:body>
@@ -1632,7 +1576,7 @@
         <w:noProof/>
       </w:rPr>
       <w:drawing>
-        <wp:anchor distT="0" distB="0" distL="114300" distR="114300" simplePos="0" relativeHeight="251660288" behindDoc="1" locked="0" layoutInCell="1" allowOverlap="1" wp14:anchorId="7B2A421B" wp14:editId="1F36F05C">
+        <wp:anchor distT="0" distB="0" distL="114300" distR="114300" simplePos="0" relativeHeight="251660288" behindDoc="1" locked="0" layoutInCell="1" allowOverlap="1" wp14:anchorId="4D45D2AE" wp14:editId="0AB038A1">
           <wp:simplePos x="0" y="0"/>
           <wp:positionH relativeFrom="column">
             <wp:posOffset>5219700</wp:posOffset>
@@ -1781,7 +1725,7 @@
         <w:noProof/>
       </w:rPr>
       <w:drawing>
-        <wp:anchor distT="0" distB="0" distL="114300" distR="114300" simplePos="0" relativeHeight="251658240" behindDoc="1" locked="0" layoutInCell="1" allowOverlap="1" wp14:anchorId="19AFB84A" wp14:editId="053DB193">
+        <wp:anchor distT="0" distB="0" distL="114300" distR="114300" simplePos="0" relativeHeight="251658240" behindDoc="1" locked="0" layoutInCell="1" allowOverlap="1" wp14:anchorId="25791CAE" wp14:editId="324E0EC9">
           <wp:simplePos x="0" y="0"/>
           <wp:positionH relativeFrom="margin">
             <wp:align>right</wp:align>
@@ -3896,6 +3840,10 @@
 </file>
 
 <file path=customXml/item1.xml><?xml version="1.0" encoding="utf-8"?>
+<b:Sources xmlns:b="http://schemas.openxmlformats.org/officeDocument/2006/bibliography" xmlns="http://schemas.openxmlformats.org/officeDocument/2006/bibliography" SelectedStyle="\APASixthEditionOfficeOnline.xsl" StyleName="APA" Version="6"/>
+</file>
+
+<file path=customXml/item2.xml><?xml version="1.0" encoding="utf-8"?>
 <ct:contentTypeSchema xmlns:ct="http://schemas.microsoft.com/office/2006/metadata/contentType" xmlns:ma="http://schemas.microsoft.com/office/2006/metadata/properties/metaAttributes" ct:_="" ma:_="" ma:contentTypeName="Document" ma:contentTypeID="0x0101002721F367071CEE4896DD5555429BBAC4" ma:contentTypeVersion="8" ma:contentTypeDescription="Create a new document." ma:contentTypeScope="" ma:versionID="fe7a963e4a6c00a96b9cb54026962d3f">
   <xsd:schema xmlns:xsd="http://www.w3.org/2001/XMLSchema" xmlns:xs="http://www.w3.org/2001/XMLSchema" xmlns:p="http://schemas.microsoft.com/office/2006/metadata/properties" xmlns:ns2="9a3d5214-0f3a-41d0-9cc0-4cb3d0f21e5b" targetNamespace="http://schemas.microsoft.com/office/2006/metadata/properties" ma:root="true" ma:fieldsID="fb251f28cb6f10c5937c8eaa2dd04c87" ns2:_="">
     <xsd:import namespace="9a3d5214-0f3a-41d0-9cc0-4cb3d0f21e5b"/>
@@ -4067,17 +4015,7 @@
 </ct:contentTypeSchema>
 </file>
 
-<file path=customXml/item2.xml><?xml version="1.0" encoding="utf-8"?>
-<b:Sources xmlns:b="http://schemas.openxmlformats.org/officeDocument/2006/bibliography" xmlns="http://schemas.openxmlformats.org/officeDocument/2006/bibliography" SelectedStyle="\APASixthEditionOfficeOnline.xsl" StyleName="APA" Version="6"/>
-</file>
-
 <file path=customXml/item3.xml><?xml version="1.0" encoding="utf-8"?>
-<p:properties xmlns:p="http://schemas.microsoft.com/office/2006/metadata/properties" xmlns:xsi="http://www.w3.org/2001/XMLSchema-instance" xmlns:pc="http://schemas.microsoft.com/office/infopath/2007/PartnerControls">
-  <documentManagement/>
-</p:properties>
-</file>
-
-<file path=customXml/item4.xml><?xml version="1.0" encoding="utf-8"?>
 <?mso-contentType ?>
 <FormTemplates xmlns="http://schemas.microsoft.com/sharepoint/v3/contenttype/forms">
   <Display>DocumentLibraryForm</Display>
@@ -4086,7 +4024,21 @@
 </FormTemplates>
 </file>
 
+<file path=customXml/item4.xml><?xml version="1.0" encoding="utf-8"?>
+<p:properties xmlns:p="http://schemas.microsoft.com/office/2006/metadata/properties" xmlns:xsi="http://www.w3.org/2001/XMLSchema-instance" xmlns:pc="http://schemas.microsoft.com/office/infopath/2007/PartnerControls">
+  <documentManagement/>
+</p:properties>
+</file>
+
 <file path=customXml/itemProps1.xml><?xml version="1.0" encoding="utf-8"?>
+<ds:datastoreItem xmlns:ds="http://schemas.openxmlformats.org/officeDocument/2006/customXml" ds:itemID="{E4D3DD68-7896-4C7F-96CB-486F25EC72F3}">
+  <ds:schemaRefs>
+    <ds:schemaRef ds:uri="http://schemas.openxmlformats.org/officeDocument/2006/bibliography"/>
+  </ds:schemaRefs>
+</ds:datastoreItem>
+</file>
+
+<file path=customXml/itemProps2.xml><?xml version="1.0" encoding="utf-8"?>
 <ds:datastoreItem xmlns:ds="http://schemas.openxmlformats.org/officeDocument/2006/customXml" ds:itemID="{64000242-6817-4F7F-9398-F87F1E5916E2}">
   <ds:schemaRefs>
     <ds:schemaRef ds:uri="http://schemas.microsoft.com/office/2006/metadata/contentType"/>
@@ -4104,27 +4056,19 @@
 </ds:datastoreItem>
 </file>
 
-<file path=customXml/itemProps2.xml><?xml version="1.0" encoding="utf-8"?>
-<ds:datastoreItem xmlns:ds="http://schemas.openxmlformats.org/officeDocument/2006/customXml" ds:itemID="{E4D3DD68-7896-4C7F-96CB-486F25EC72F3}">
+<file path=customXml/itemProps3.xml><?xml version="1.0" encoding="utf-8"?>
+<ds:datastoreItem xmlns:ds="http://schemas.openxmlformats.org/officeDocument/2006/customXml" ds:itemID="{3132D4A4-5C44-46CD-A86A-4991EA9F08B1}">
   <ds:schemaRefs>
-    <ds:schemaRef ds:uri="http://schemas.openxmlformats.org/officeDocument/2006/bibliography"/>
+    <ds:schemaRef ds:uri="http://schemas.microsoft.com/sharepoint/v3/contenttype/forms"/>
   </ds:schemaRefs>
 </ds:datastoreItem>
 </file>
 
-<file path=customXml/itemProps3.xml><?xml version="1.0" encoding="utf-8"?>
+<file path=customXml/itemProps4.xml><?xml version="1.0" encoding="utf-8"?>
 <ds:datastoreItem xmlns:ds="http://schemas.openxmlformats.org/officeDocument/2006/customXml" ds:itemID="{F5011B99-2705-4E9B-BFAC-C71B15C2BA1F}">
   <ds:schemaRefs>
     <ds:schemaRef ds:uri="http://schemas.microsoft.com/office/2006/metadata/properties"/>
     <ds:schemaRef ds:uri="http://schemas.microsoft.com/office/infopath/2007/PartnerControls"/>
   </ds:schemaRefs>
 </ds:datastoreItem>
-</file>
-
-<file path=customXml/itemProps4.xml><?xml version="1.0" encoding="utf-8"?>
-<ds:datastoreItem xmlns:ds="http://schemas.openxmlformats.org/officeDocument/2006/customXml" ds:itemID="{3132D4A4-5C44-46CD-A86A-4991EA9F08B1}">
-  <ds:schemaRefs>
-    <ds:schemaRef ds:uri="http://schemas.microsoft.com/sharepoint/v3/contenttype/forms"/>
-  </ds:schemaRefs>
-</ds:datastoreItem>
 </file>
</xml_diff>

<commit_message>
Right-align VHB logo on landscape appendix page; enlarge concept plan
The landscape section now uses its own header (copy of the continuation
header with the logo anchored to the right margin instead of a fixed
portrait-width offset), and the appendix concept plan grows to about
9.3 x 6.6 inches using tightened top/bottom margins on that page only.
Portrait pages unchanged.

Co-Authored-By: Claude Fable 5 <noreply@anthropic.com>
Claude-Session: https://claude.ai/code/session_017bgXFHUDEAABZN3aMvsVWj
</commit_message>
<xml_diff>
--- a/3905_Page_Rd_Trip_Generation/3905_Page_Road_Trip_Gen_Memo.docx
+++ b/3905_Page_Rd_Trip_Generation/3905_Page_Road_Trip_Gen_Memo.docx
@@ -1448,7 +1448,7 @@
         <w:lastRenderedPageBreak/>
         <w:drawing>
           <wp:inline distT="0" distB="0" distL="0" distR="0" wp14:anchorId="346A2E69" wp14:editId="68834AA3">
-            <wp:extent cx="7728000" cy="5520000"/>
+            <wp:extent cx="8474659" cy="6053328"/>
             <wp:effectExtent l="0" t="0" r="0" b="0"/>
             <wp:docPr id="900" name="Picture 900" descr="Concept plan - 3905 Page Rd"/>
             <wp:cNvGraphicFramePr>
@@ -1470,7 +1470,7 @@
                   <pic:spPr>
                     <a:xfrm>
                       <a:off x="0" y="0"/>
-                      <a:ext cx="7728000" cy="5520000"/>
+                      <a:ext cx="8474659" cy="6053328"/>
                     </a:xfrm>
                     <a:prstGeom prst="rect">
                       <a:avLst/>
@@ -1484,11 +1484,11 @@
       </w:r>
     </w:p>
     <w:sectPr>
-      <w:headerReference w:type="default" r:id="rId13"/>
+      <w:headerReference w:type="default" r:id="rId20"/>
       <w:headerReference w:type="first" r:id="rId14"/>
       <w:footerReference w:type="first" r:id="rId15"/>
       <w:pgSz w:w="15840" w:h="12240" w:orient="landscape"/>
-      <w:pgMar w:top="2074" w:right="720" w:bottom="1296" w:left="1080" w:header="720" w:footer="288" w:gutter="0"/>
+      <w:pgMar w:top="1800" w:right="720" w:bottom="720" w:left="1080" w:header="720" w:footer="288" w:gutter="0"/>
       <w:cols w:space="720"/>
       <w:docGrid w:linePitch="360"/>
     </w:sectPr>
@@ -1790,6 +1790,163 @@
         </wp:anchor>
       </w:drawing>
     </w:r>
+  </w:p>
+</w:hdr>
+</file>
+
+<file path=word/header3.xml><?xml version="1.0" encoding="utf-8"?>
+<w:hdr xmlns:wpc="http://schemas.microsoft.com/office/word/2010/wordprocessingCanvas" xmlns:cx="http://schemas.microsoft.com/office/drawing/2014/chartex" xmlns:cx1="http://schemas.microsoft.com/office/drawing/2015/9/8/chartex" xmlns:cx2="http://schemas.microsoft.com/office/drawing/2015/10/21/chartex" xmlns:cx3="http://schemas.microsoft.com/office/drawing/2016/5/9/chartex" xmlns:cx4="http://schemas.microsoft.com/office/drawing/2016/5/10/chartex" xmlns:cx5="http://schemas.microsoft.com/office/drawing/2016/5/11/chartex" xmlns:cx6="http://schemas.microsoft.com/office/drawing/2016/5/12/chartex" xmlns:cx7="http://schemas.microsoft.com/office/drawing/2016/5/13/chartex" xmlns:cx8="http://schemas.microsoft.com/office/drawing/2016/5/14/chartex" xmlns:mc="http://schemas.openxmlformats.org/markup-compatibility/2006" xmlns:aink="http://schemas.microsoft.com/office/drawing/2016/ink" xmlns:am3d="http://schemas.microsoft.com/office/drawing/2017/model3d" xmlns:o="urn:schemas-microsoft-com:office:office" xmlns:oel="http://schemas.microsoft.com/office/2019/extlst" xmlns:r="http://schemas.openxmlformats.org/officeDocument/2006/relationships" xmlns:m="http://schemas.openxmlformats.org/officeDocument/2006/math" xmlns:v="urn:schemas-microsoft-com:vml" xmlns:wp14="http://schemas.microsoft.com/office/word/2010/wordprocessingDrawing" xmlns:wp="http://schemas.openxmlformats.org/drawingml/2006/wordprocessingDrawing" xmlns:w10="urn:schemas-microsoft-com:office:word" xmlns:w="http://schemas.openxmlformats.org/wordprocessingml/2006/main" xmlns:w14="http://schemas.microsoft.com/office/word/2010/wordml" xmlns:w15="http://schemas.microsoft.com/office/word/2012/wordml" xmlns:w16cex="http://schemas.microsoft.com/office/word/2018/wordml/cex" xmlns:w16cid="http://schemas.microsoft.com/office/word/2016/wordml/cid" xmlns:w16="http://schemas.microsoft.com/office/word/2018/wordml" xmlns:w16du="http://schemas.microsoft.com/office/word/2023/wordml/word16du" xmlns:w16sdtdh="http://schemas.microsoft.com/office/word/2020/wordml/sdtdatahash" xmlns:w16sdtfl="http://schemas.microsoft.com/office/word/2024/wordml/sdtformatlock" xmlns:w16se="http://schemas.microsoft.com/office/word/2015/wordml/symex" xmlns:wpg="http://schemas.microsoft.com/office/word/2010/wordprocessingGroup" xmlns:wpi="http://schemas.microsoft.com/office/word/2010/wordprocessingInk" xmlns:wne="http://schemas.microsoft.com/office/word/2006/wordml" xmlns:wps="http://schemas.microsoft.com/office/word/2010/wordprocessingShape" mc:Ignorable="w14 w15 w16se w16cid w16 w16cex w16sdtdh w16sdtfl w16du wp14">
+  <w:p>
+    <w:pPr>
+      <w:pStyle w:val="Header"/>
+    </w:pPr>
+    <w:bookmarkStart w:id="3" w:name="_Hlk68247075"/>
+    <w:bookmarkStart w:id="4" w:name="_Hlk68247076"/>
+    <w:r>
+      <w:rPr>
+        <w:sz w:val="18"/>
+      </w:rPr>
+      <w:t xml:space="preserve">3905 Page Road Industrial Trip Generation </w:t>
+    </w:r>
+    <w:r>
+      <w:rPr>
+        <w:noProof/>
+      </w:rPr>
+      <w:drawing>
+        <wp:anchor distT="0" distB="0" distL="114300" distR="114300" simplePos="0" relativeHeight="251660288" behindDoc="1" locked="0" layoutInCell="1" allowOverlap="1" wp14:anchorId="4D45D2AE" wp14:editId="0AB038A1">
+          <wp:simplePos x="0" y="0"/>
+          <wp:positionH relativeFrom="margin">
+            <wp:align>right</wp:align>
+          </wp:positionH>
+          <wp:positionV relativeFrom="paragraph">
+            <wp:posOffset>-85090</wp:posOffset>
+          </wp:positionV>
+          <wp:extent cx="1466850" cy="661143"/>
+          <wp:effectExtent l="0" t="0" r="0" b="5715"/>
+          <wp:wrapNone/>
+          <wp:docPr id="11" name="Picture 11"/>
+          <wp:cNvGraphicFramePr>
+            <a:graphicFrameLocks xmlns:a="http://schemas.openxmlformats.org/drawingml/2006/main" noChangeAspect="1"/>
+          </wp:cNvGraphicFramePr>
+          <a:graphic xmlns:a="http://schemas.openxmlformats.org/drawingml/2006/main">
+            <a:graphicData uri="http://schemas.openxmlformats.org/drawingml/2006/picture">
+              <pic:pic xmlns:pic="http://schemas.openxmlformats.org/drawingml/2006/picture">
+                <pic:nvPicPr>
+                  <pic:cNvPr id="0" name="Picture 1"/>
+                  <pic:cNvPicPr>
+                    <a:picLocks noChangeAspect="1" noChangeArrowheads="1"/>
+                  </pic:cNvPicPr>
+                </pic:nvPicPr>
+                <pic:blipFill rotWithShape="1">
+                  <a:blip r:embed="rId1">
+                    <a:extLst>
+                      <a:ext uri="{28A0092B-C50C-407E-A947-70E740481C1C}">
+                        <a14:useLocalDpi xmlns:a14="http://schemas.microsoft.com/office/drawing/2010/main" val="0"/>
+                      </a:ext>
+                    </a:extLst>
+                  </a:blip>
+                  <a:srcRect t="4625" b="84503"/>
+                  <a:stretch/>
+                </pic:blipFill>
+                <pic:spPr bwMode="auto">
+                  <a:xfrm>
+                    <a:off x="0" y="0"/>
+                    <a:ext cx="1466850" cy="661143"/>
+                  </a:xfrm>
+                  <a:prstGeom prst="rect">
+                    <a:avLst/>
+                  </a:prstGeom>
+                  <a:noFill/>
+                  <a:ln>
+                    <a:noFill/>
+                  </a:ln>
+                  <a:extLst>
+                    <a:ext uri="{53640926-AAD7-44D8-BBD7-CCE9431645EC}">
+                      <a14:shadowObscured xmlns:a14="http://schemas.microsoft.com/office/drawing/2010/main"/>
+                    </a:ext>
+                  </a:extLst>
+                </pic:spPr>
+              </pic:pic>
+            </a:graphicData>
+          </a:graphic>
+          <wp14:sizeRelH relativeFrom="page">
+            <wp14:pctWidth>0</wp14:pctWidth>
+          </wp14:sizeRelH>
+          <wp14:sizeRelV relativeFrom="page">
+            <wp14:pctHeight>0</wp14:pctHeight>
+          </wp14:sizeRelV>
+        </wp:anchor>
+      </w:drawing>
+    </w:r>
+    <w:r>
+      <w:t xml:space="preserve"> </w:t>
+    </w:r>
+  </w:p>
+  <w:p>
+    <w:pPr>
+      <w:pStyle w:val="Header"/>
+    </w:pPr>
+    <w:r>
+      <w:t>Ref:</w:t>
+    </w:r>
+    <w:r>
+      <w:t xml:space="preserve"> </w:t>
+    </w:r>
+    <w:r>
+      <w:t xml:space="preserve"> </w:t>
+    </w:r>
+    <w:r>
+      <w:t>R205114.000</w:t>
+    </w:r>
+  </w:p>
+  <w:p>
+    <w:pPr>
+      <w:pStyle w:val="Header"/>
+    </w:pPr>
+    <w:r>
+      <w:t xml:space="preserve">August </w:t>
+    </w:r>
+    <w:r>
+      <w:t>7</w:t>
+    </w:r>
+    <w:r>
+      <w:t>, 2026</w:t>
+    </w:r>
+  </w:p>
+  <w:p>
+    <w:pPr>
+      <w:pStyle w:val="Header"/>
+    </w:pPr>
+    <w:r>
+      <w:t xml:space="preserve">Page </w:t>
+    </w:r>
+    <w:r>
+      <w:fldChar w:fldCharType="begin"/>
+    </w:r>
+    <w:r>
+      <w:instrText xml:space="preserve"> PAGE   \* MERGEFORMAT </w:instrText>
+    </w:r>
+    <w:r>
+      <w:fldChar w:fldCharType="separate"/>
+    </w:r>
+    <w:r>
+      <w:t>2</w:t>
+    </w:r>
+    <w:r>
+      <w:fldChar w:fldCharType="end"/>
+    </w:r>
+  </w:p>
+  <w:p>
+    <w:pPr>
+      <w:pStyle w:val="Header"/>
+    </w:pPr>
+  </w:p>
+  <w:bookmarkEnd w:id="3"/>
+  <w:bookmarkEnd w:id="4"/>
+  <w:p>
+    <w:pPr>
+      <w:pStyle w:val="Header"/>
+    </w:pPr>
   </w:p>
 </w:hdr>
 </file>

</xml_diff>

<commit_message>
Remove average-rates note and its table superscript
Drop note 2 ("Total site trips are determined based on the ITE average
rates") and the superscript 2 on the Total Site Trips band from both
the memo Table 1 and the workbook TripGen sheet; note 1 and the LUC
superscript remain.

Co-Authored-By: Claude Fable 5 <noreply@anthropic.com>
Claude-Session: https://claude.ai/code/session_017bgXFHUDEAABZN3aMvsVWj
</commit_message>
<xml_diff>
--- a/3905_Page_Rd_Trip_Generation/3905_Page_Road_Trip_Gen_Memo.docx
+++ b/3905_Page_Rd_Trip_Generation/3905_Page_Road_Trip_Gen_Memo.docx
@@ -1048,14 +1048,6 @@
               </w:rPr>
               <w:t>Total Site Trips</w:t>
             </w:r>
-            <w:r>
-              <w:rPr>
-                <w:b/>
-                <w:sz w:val="20"/>
-                <w:vertAlign w:val="superscript"/>
-              </w:rPr>
-              <w:t>2</w:t>
-            </w:r>
           </w:p>
         </w:tc>
       </w:tr>
@@ -1316,19 +1308,6 @@
           <w:szCs w:val="16"/>
         </w:rPr>
         <w:t xml:space="preserve"> Edition</w:t>
-      </w:r>
-    </w:p>
-    <w:p>
-      <w:pPr>
-        <w:pStyle w:val="BodyText"/>
-        <w:spacing w:after="0"/>
-      </w:pPr>
-      <w:r>
-        <w:rPr>
-          <w:sz w:val="16"/>
-          <w:szCs w:val="16"/>
-        </w:rPr>
-        <w:t>2. Total site trips are determined based on the ITE average rates</w:t>
       </w:r>
     </w:p>
     <w:p>

</xml_diff>